<commit_message>
agrega README con captura
</commit_message>
<xml_diff>
--- a/proyecto_final_api.docx
+++ b/proyecto_final_api.docx
@@ -51,6 +51,7 @@
           <w:szCs w:val="24"/>
         </w:rPr>
       </w:pPr>
+      <w:proofErr w:type="spellStart"/>
       <w:r>
         <w:rPr>
           <w:rFonts w:ascii="Arial" w:hAnsi="Arial" w:cs="Arial"/>
@@ -59,6 +60,7 @@
         </w:rPr>
         <w:t>Javascript</w:t>
       </w:r>
+      <w:proofErr w:type="spellEnd"/>
     </w:p>
     <w:p>
       <w:pPr>
@@ -126,7 +128,43 @@
           <w:sz w:val="24"/>
           <w:szCs w:val="24"/>
         </w:rPr>
-        <w:t>Durante el desarrollo se aplicaron tecnologías como HTML para la estructura, CSS para el diseño visual y JavaScript para la lógica de programación, incluyendo el uso de asincronía mediante async/await y la manipulación del DOM para mostrar los resultados en pantalla.</w:t>
+        <w:t xml:space="preserve">Durante el desarrollo se aplicaron tecnologías como HTML para la estructura, CSS para el diseño visual y JavaScript para la lógica de programación, incluyendo el uso de asincronía mediante </w:t>
+      </w:r>
+      <w:proofErr w:type="spellStart"/>
+      <w:r>
+        <w:rPr>
+          <w:rFonts w:ascii="Arial" w:hAnsi="Arial" w:cs="Arial"/>
+          <w:sz w:val="24"/>
+          <w:szCs w:val="24"/>
+        </w:rPr>
+        <w:t>async</w:t>
+      </w:r>
+      <w:proofErr w:type="spellEnd"/>
+      <w:r>
+        <w:rPr>
+          <w:rFonts w:ascii="Arial" w:hAnsi="Arial" w:cs="Arial"/>
+          <w:sz w:val="24"/>
+          <w:szCs w:val="24"/>
+        </w:rPr>
+        <w:t>/</w:t>
+      </w:r>
+      <w:proofErr w:type="spellStart"/>
+      <w:r>
+        <w:rPr>
+          <w:rFonts w:ascii="Arial" w:hAnsi="Arial" w:cs="Arial"/>
+          <w:sz w:val="24"/>
+          <w:szCs w:val="24"/>
+        </w:rPr>
+        <w:t>await</w:t>
+      </w:r>
+      <w:proofErr w:type="spellEnd"/>
+      <w:r>
+        <w:rPr>
+          <w:rFonts w:ascii="Arial" w:hAnsi="Arial" w:cs="Arial"/>
+          <w:sz w:val="24"/>
+          <w:szCs w:val="24"/>
+        </w:rPr>
+        <w:t xml:space="preserve"> y la manipulación del DOM para mostrar los resultados en pantalla.</w:t>
       </w:r>
     </w:p>
     <w:p>
@@ -204,59 +242,176 @@
           <w:sz w:val="24"/>
           <w:szCs w:val="24"/>
         </w:rPr>
-        <w:t>El desarrollo de este proyecto tiene como propósito aplicar de manera práctica los conocimientos adquiridos durante el curso de JavaScript, integrando diferentes tecnologías y herramientas fundamentales en el desarrollo web.</w:t>
-      </w:r>
-    </w:p>
-    <w:p>
-      <w:pPr>
-        <w:rPr>
-          <w:rFonts w:ascii="Arial" w:hAnsi="Arial" w:cs="Arial"/>
-          <w:sz w:val="24"/>
-          <w:szCs w:val="24"/>
-        </w:rPr>
-      </w:pPr>
-      <w:r>
-        <w:rPr>
-          <w:rFonts w:ascii="Arial" w:hAnsi="Arial" w:cs="Arial"/>
-          <w:sz w:val="24"/>
-          <w:szCs w:val="24"/>
-        </w:rPr>
-        <w:t>En primer lugar, se busca aplicar el flujo completo de desarrollo web, utilizando HTML para la estructura del sitio, CSS para el diseño visual y JavaScript para la implementación de la lógica e interacción con el usuario.</w:t>
-      </w:r>
-    </w:p>
-    <w:p>
-      <w:pPr>
-        <w:rPr>
-          <w:rFonts w:ascii="Arial" w:hAnsi="Arial" w:cs="Arial"/>
-          <w:sz w:val="24"/>
-          <w:szCs w:val="24"/>
-        </w:rPr>
-      </w:pPr>
-      <w:r>
-        <w:rPr>
-          <w:rFonts w:ascii="Arial" w:hAnsi="Arial" w:cs="Arial"/>
-          <w:sz w:val="24"/>
-          <w:szCs w:val="24"/>
-        </w:rPr>
-        <w:t>Además, se pretende implementar el control de versiones del proyecto mediante el uso de Git y su publicación en la plataforma GitHub, permitiendo llevar un seguimiento organizado de los cambios realizados durante el desarrollo.</w:t>
-      </w:r>
-    </w:p>
-    <w:p>
-      <w:pPr>
-        <w:rPr>
-          <w:rFonts w:ascii="Arial" w:hAnsi="Arial" w:cs="Arial"/>
-          <w:sz w:val="24"/>
-          <w:szCs w:val="24"/>
-        </w:rPr>
-      </w:pPr>
-      <w:r>
-        <w:rPr>
-          <w:rFonts w:ascii="Arial" w:hAnsi="Arial" w:cs="Arial"/>
-          <w:sz w:val="24"/>
-          <w:szCs w:val="24"/>
-        </w:rPr>
-        <w:t xml:space="preserve">Otro objetivo fundamental es consumir datos desde una API pública, en este caso la Rick and Morty API, utilizando funciones como fetch y el manejo de </w:t>
-      </w:r>
+        <w:t>En esta sección se implementa la lógica del proyecto mediante JavaScript, haciendo uso del DOM (</w:t>
+      </w:r>
+      <w:proofErr w:type="spellStart"/>
+      <w:r>
+        <w:rPr>
+          <w:rFonts w:ascii="Arial" w:hAnsi="Arial" w:cs="Arial"/>
+          <w:sz w:val="24"/>
+          <w:szCs w:val="24"/>
+        </w:rPr>
+        <w:t>Document</w:t>
+      </w:r>
+      <w:proofErr w:type="spellEnd"/>
+      <w:r>
+        <w:rPr>
+          <w:rFonts w:ascii="Arial" w:hAnsi="Arial" w:cs="Arial"/>
+          <w:sz w:val="24"/>
+          <w:szCs w:val="24"/>
+        </w:rPr>
+        <w:t xml:space="preserve"> </w:t>
+      </w:r>
+      <w:proofErr w:type="spellStart"/>
+      <w:r>
+        <w:rPr>
+          <w:rFonts w:ascii="Arial" w:hAnsi="Arial" w:cs="Arial"/>
+          <w:sz w:val="24"/>
+          <w:szCs w:val="24"/>
+        </w:rPr>
+        <w:t>Object</w:t>
+      </w:r>
+      <w:proofErr w:type="spellEnd"/>
+      <w:r>
+        <w:rPr>
+          <w:rFonts w:ascii="Arial" w:hAnsi="Arial" w:cs="Arial"/>
+          <w:sz w:val="24"/>
+          <w:szCs w:val="24"/>
+        </w:rPr>
+        <w:t xml:space="preserve"> Model) para interactuar dinámicamente con los elementos de la página web.</w:t>
+      </w:r>
+    </w:p>
+    <w:p>
+      <w:pPr>
+        <w:rPr>
+          <w:rFonts w:ascii="Arial" w:hAnsi="Arial" w:cs="Arial"/>
+          <w:sz w:val="24"/>
+          <w:szCs w:val="24"/>
+        </w:rPr>
+      </w:pPr>
+      <w:r>
+        <w:rPr>
+          <w:rFonts w:ascii="Arial" w:hAnsi="Arial" w:cs="Arial"/>
+          <w:sz w:val="24"/>
+          <w:szCs w:val="24"/>
+        </w:rPr>
+        <w:t xml:space="preserve">Inicialmente, se seleccionan los elementos del HTML, como el botón de búsqueda y el contenedor donde se mostrarán los resultados, utilizando métodos como </w:t>
+      </w:r>
+      <w:proofErr w:type="spellStart"/>
+      <w:r>
+        <w:rPr>
+          <w:rFonts w:ascii="Arial" w:hAnsi="Arial" w:cs="Arial"/>
+          <w:sz w:val="24"/>
+          <w:szCs w:val="24"/>
+        </w:rPr>
+        <w:t>document.getElementById</w:t>
+      </w:r>
+      <w:proofErr w:type="spellEnd"/>
+      <w:r>
+        <w:rPr>
+          <w:rFonts w:ascii="Arial" w:hAnsi="Arial" w:cs="Arial"/>
+          <w:sz w:val="24"/>
+          <w:szCs w:val="24"/>
+        </w:rPr>
+        <w:t>.</w:t>
+      </w:r>
+    </w:p>
+    <w:p>
+      <w:pPr>
+        <w:rPr>
+          <w:rFonts w:ascii="Arial" w:hAnsi="Arial" w:cs="Arial"/>
+          <w:sz w:val="24"/>
+          <w:szCs w:val="24"/>
+        </w:rPr>
+      </w:pPr>
+      <w:r>
+        <w:rPr>
+          <w:rFonts w:ascii="Arial" w:hAnsi="Arial" w:cs="Arial"/>
+          <w:sz w:val="24"/>
+          <w:szCs w:val="24"/>
+        </w:rPr>
+        <w:t xml:space="preserve">Posteriormente, se agrega un evento de tipo </w:t>
+      </w:r>
+      <w:proofErr w:type="spellStart"/>
+      <w:r>
+        <w:rPr>
+          <w:rFonts w:ascii="Arial" w:hAnsi="Arial" w:cs="Arial"/>
+          <w:sz w:val="24"/>
+          <w:szCs w:val="24"/>
+        </w:rPr>
+        <w:t>click</w:t>
+      </w:r>
+      <w:proofErr w:type="spellEnd"/>
+      <w:r>
+        <w:rPr>
+          <w:rFonts w:ascii="Arial" w:hAnsi="Arial" w:cs="Arial"/>
+          <w:sz w:val="24"/>
+          <w:szCs w:val="24"/>
+        </w:rPr>
+        <w:t xml:space="preserve"> al botón, el cual ejecuta una función encargada de realizar la consulta a la API y procesar la información obtenida.</w:t>
+      </w:r>
+    </w:p>
+    <w:p>
+      <w:pPr>
+        <w:rPr>
+          <w:rFonts w:ascii="Arial" w:hAnsi="Arial" w:cs="Arial"/>
+          <w:sz w:val="24"/>
+          <w:szCs w:val="24"/>
+        </w:rPr>
+      </w:pPr>
+      <w:r>
+        <w:rPr>
+          <w:rFonts w:ascii="Arial" w:hAnsi="Arial" w:cs="Arial"/>
+          <w:sz w:val="24"/>
+          <w:szCs w:val="24"/>
+        </w:rPr>
+        <w:t xml:space="preserve">Para mostrar los datos, se crean dinámicamente tarjetas mediante el uso de </w:t>
+      </w:r>
+      <w:proofErr w:type="spellStart"/>
+      <w:r>
+        <w:rPr>
+          <w:rFonts w:ascii="Arial" w:hAnsi="Arial" w:cs="Arial"/>
+          <w:sz w:val="24"/>
+          <w:szCs w:val="24"/>
+        </w:rPr>
+        <w:t>template</w:t>
+      </w:r>
+      <w:proofErr w:type="spellEnd"/>
+      <w:r>
+        <w:rPr>
+          <w:rFonts w:ascii="Arial" w:hAnsi="Arial" w:cs="Arial"/>
+          <w:sz w:val="24"/>
+          <w:szCs w:val="24"/>
+        </w:rPr>
+        <w:t xml:space="preserve"> </w:t>
+      </w:r>
+      <w:proofErr w:type="spellStart"/>
+      <w:r>
+        <w:rPr>
+          <w:rFonts w:ascii="Arial" w:hAnsi="Arial" w:cs="Arial"/>
+          <w:sz w:val="24"/>
+          <w:szCs w:val="24"/>
+        </w:rPr>
+        <w:t>literals</w:t>
+      </w:r>
+      <w:proofErr w:type="spellEnd"/>
+      <w:r>
+        <w:rPr>
+          <w:rFonts w:ascii="Arial" w:hAnsi="Arial" w:cs="Arial"/>
+          <w:sz w:val="24"/>
+          <w:szCs w:val="24"/>
+        </w:rPr>
+        <w:t>, insertando contenido HTML dentro de cada elemento. Estas tarjetas incluyen información relevante como la imagen, el nombre y el estado de los personajes.</w:t>
+      </w:r>
+    </w:p>
+    <w:p>
+      <w:pPr>
+        <w:rPr>
+          <w:rFonts w:ascii="Arial" w:hAnsi="Arial" w:cs="Arial"/>
+          <w:sz w:val="24"/>
+          <w:szCs w:val="24"/>
+        </w:rPr>
+      </w:pPr>
       <w:r>
         <w:rPr>
           <w:rFonts w:ascii="Arial" w:hAnsi="Arial" w:cs="Arial"/>
@@ -264,41 +419,42 @@
           <w:szCs w:val="24"/>
         </w:rPr>
         <w:lastRenderedPageBreak/>
-        <w:t>asincronía mediante async/await, lo cual permite obtener información en formato JSON desde un servicio externo.</w:t>
-      </w:r>
-    </w:p>
-    <w:p>
-      <w:pPr>
-        <w:rPr>
-          <w:rFonts w:ascii="Arial" w:hAnsi="Arial" w:cs="Arial"/>
-          <w:sz w:val="24"/>
-          <w:szCs w:val="24"/>
-        </w:rPr>
-      </w:pPr>
-      <w:r>
-        <w:rPr>
-          <w:rFonts w:ascii="Arial" w:hAnsi="Arial" w:cs="Arial"/>
-          <w:sz w:val="24"/>
-          <w:szCs w:val="24"/>
-        </w:rPr>
-        <w:t>Asimismo, se busca manipular el DOM para mostrar de manera dinámica la información obtenida de la API en la página web, mejorando la experiencia del usuario mediante una interfaz interactiva.</w:t>
-      </w:r>
-    </w:p>
-    <w:p>
-      <w:pPr>
-        <w:rPr>
-          <w:rFonts w:ascii="Arial" w:hAnsi="Arial" w:cs="Arial"/>
-          <w:sz w:val="24"/>
-          <w:szCs w:val="24"/>
-        </w:rPr>
-      </w:pPr>
-      <w:r>
-        <w:rPr>
-          <w:rFonts w:ascii="Arial" w:hAnsi="Arial" w:cs="Arial"/>
-          <w:sz w:val="24"/>
-          <w:szCs w:val="24"/>
-        </w:rPr>
-        <w:t>Finalmente, el proyecto promueve el uso responsable de herramientas de inteligencia artificial como apoyo en el aprendizaje, facilitando la comprensión de conceptos, la solución de errores y la optimización del desarrollo.</w:t>
+        <w:t xml:space="preserve">Antes de mostrar nuevos resultados, se limpia el contenido del contenedor para evitar duplicados, utilizando la propiedad </w:t>
+      </w:r>
+      <w:proofErr w:type="spellStart"/>
+      <w:r>
+        <w:rPr>
+          <w:rFonts w:ascii="Arial" w:hAnsi="Arial" w:cs="Arial"/>
+          <w:sz w:val="24"/>
+          <w:szCs w:val="24"/>
+        </w:rPr>
+        <w:t>innerHTML</w:t>
+      </w:r>
+      <w:proofErr w:type="spellEnd"/>
+      <w:r>
+        <w:rPr>
+          <w:rFonts w:ascii="Arial" w:hAnsi="Arial" w:cs="Arial"/>
+          <w:sz w:val="24"/>
+          <w:szCs w:val="24"/>
+        </w:rPr>
+        <w:t>.</w:t>
+      </w:r>
+    </w:p>
+    <w:p>
+      <w:pPr>
+        <w:rPr>
+          <w:rFonts w:ascii="Arial" w:hAnsi="Arial" w:cs="Arial"/>
+          <w:sz w:val="24"/>
+          <w:szCs w:val="24"/>
+        </w:rPr>
+      </w:pPr>
+      <w:r>
+        <w:rPr>
+          <w:rFonts w:ascii="Arial" w:hAnsi="Arial" w:cs="Arial"/>
+          <w:sz w:val="24"/>
+          <w:szCs w:val="24"/>
+        </w:rPr>
+        <w:t>Finalmente, los elementos generados son insertados en el DOM, permitiendo que el usuario visualice los datos de forma dinámica e interactiva.</w:t>
       </w:r>
     </w:p>
     <w:p>
@@ -410,7 +566,25 @@
           <w:sz w:val="24"/>
           <w:szCs w:val="24"/>
         </w:rPr>
-        <w:t>Asimismo, el sistema maneja diferentes estados durante la consulta a la API, incluyendo un estado de carga mientras se obtienen los datos, un estado de éxito cuando la información se muestra correctamente, y un estado de error en caso de que no se encuentren resultados o ocurra algún problema en la petición.</w:t>
+        <w:t xml:space="preserve">Asimismo, el sistema maneja diferentes estados durante la consulta a la API, incluyendo un estado de carga mientras se obtienen los datos, un estado de éxito cuando la información se muestra correctamente, y un estado de error en caso de que no se encuentren resultados </w:t>
+      </w:r>
+      <w:proofErr w:type="spellStart"/>
+      <w:r>
+        <w:rPr>
+          <w:rFonts w:ascii="Arial" w:hAnsi="Arial" w:cs="Arial"/>
+          <w:sz w:val="24"/>
+          <w:szCs w:val="24"/>
+        </w:rPr>
+        <w:t>o</w:t>
+      </w:r>
+      <w:proofErr w:type="spellEnd"/>
+      <w:r>
+        <w:rPr>
+          <w:rFonts w:ascii="Arial" w:hAnsi="Arial" w:cs="Arial"/>
+          <w:sz w:val="24"/>
+          <w:szCs w:val="24"/>
+        </w:rPr>
+        <w:t xml:space="preserve"> ocurra algún problema en la petición.</w:t>
       </w:r>
     </w:p>
     <w:p>
@@ -479,8 +653,17 @@
           <w:sz w:val="24"/>
           <w:szCs w:val="24"/>
         </w:rPr>
-        <w:t xml:space="preserve">La elección de esta API se debe a que es de acceso libre y no requiere el uso de una clave de autenticación (API Key), lo cual facilita su implementación, </w:t>
-      </w:r>
+        <w:t>La elección de esta API se debe a que es de acceso libre y no requiere el uso de una clave de autenticación (API Key), lo cual facilita su implementación, especialmente para proyectos de aprendizaje. Además, la información se encuentra organizada en formato JSON, lo que permite su fácil interpretación y manipulación mediante JavaScript.</w:t>
+      </w:r>
+    </w:p>
+    <w:p>
+      <w:pPr>
+        <w:rPr>
+          <w:rFonts w:ascii="Arial" w:hAnsi="Arial" w:cs="Arial"/>
+          <w:sz w:val="24"/>
+          <w:szCs w:val="24"/>
+        </w:rPr>
+      </w:pPr>
       <w:r>
         <w:rPr>
           <w:rFonts w:ascii="Arial" w:hAnsi="Arial" w:cs="Arial"/>
@@ -488,23 +671,6 @@
           <w:szCs w:val="24"/>
         </w:rPr>
         <w:lastRenderedPageBreak/>
-        <w:t>especialmente para proyectos de aprendizaje. Además, la información se encuentra organizada en formato JSON, lo que permite su fácil interpretación y manipulación mediante JavaScript.</w:t>
-      </w:r>
-    </w:p>
-    <w:p>
-      <w:pPr>
-        <w:rPr>
-          <w:rFonts w:ascii="Arial" w:hAnsi="Arial" w:cs="Arial"/>
-          <w:sz w:val="24"/>
-          <w:szCs w:val="24"/>
-        </w:rPr>
-      </w:pPr>
-      <w:r>
-        <w:rPr>
-          <w:rFonts w:ascii="Arial" w:hAnsi="Arial" w:cs="Arial"/>
-          <w:sz w:val="24"/>
-          <w:szCs w:val="24"/>
-        </w:rPr>
         <w:t>Esta API ofrece datos relevantes como el nombre, estado, especie e imagen de los personajes, lo cual resulta ideal para ser representado visualmente en una interfaz web mediante tarjetas.</w:t>
       </w:r>
     </w:p>
@@ -669,24 +835,132 @@
           <w:sz w:val="24"/>
           <w:szCs w:val="24"/>
         </w:rPr>
-        <w:t>Durante el desarrollo del presente proyecto se hizo uso de herramientas de inteligencia artificial como apoyo en el proceso de aprendizaje, entre ellas ChatGPT y GitHub Copilot.</w:t>
-      </w:r>
-    </w:p>
-    <w:p>
-      <w:pPr>
-        <w:rPr>
-          <w:rFonts w:ascii="Arial" w:hAnsi="Arial" w:cs="Arial"/>
-          <w:sz w:val="24"/>
-          <w:szCs w:val="24"/>
-        </w:rPr>
-      </w:pPr>
-      <w:r>
-        <w:rPr>
-          <w:rFonts w:ascii="Arial" w:hAnsi="Arial" w:cs="Arial"/>
-          <w:sz w:val="24"/>
-          <w:szCs w:val="24"/>
-        </w:rPr>
-        <w:t>Estas herramientas fueron utilizadas de manera responsable, con el objetivo de comprender mejor los conceptos trabajados en el curso y resolver dudas puntuales durante el desarrollo del proyecto. Por ejemplo, se emplearon para obtener explicaciones sobre el consumo de APIs, el uso de fetch y async/await, así como para entender errores presentados en la consola.</w:t>
+        <w:t xml:space="preserve">Durante el desarrollo del presente proyecto se hizo uso de herramientas de inteligencia artificial como apoyo en el proceso de aprendizaje, entre ellas </w:t>
+      </w:r>
+      <w:proofErr w:type="spellStart"/>
+      <w:r>
+        <w:rPr>
+          <w:rFonts w:ascii="Arial" w:hAnsi="Arial" w:cs="Arial"/>
+          <w:sz w:val="24"/>
+          <w:szCs w:val="24"/>
+        </w:rPr>
+        <w:t>ChatGPT</w:t>
+      </w:r>
+      <w:proofErr w:type="spellEnd"/>
+      <w:r>
+        <w:rPr>
+          <w:rFonts w:ascii="Arial" w:hAnsi="Arial" w:cs="Arial"/>
+          <w:sz w:val="24"/>
+          <w:szCs w:val="24"/>
+        </w:rPr>
+        <w:t xml:space="preserve"> y GitHub </w:t>
+      </w:r>
+      <w:proofErr w:type="spellStart"/>
+      <w:r>
+        <w:rPr>
+          <w:rFonts w:ascii="Arial" w:hAnsi="Arial" w:cs="Arial"/>
+          <w:sz w:val="24"/>
+          <w:szCs w:val="24"/>
+        </w:rPr>
+        <w:t>Copilot</w:t>
+      </w:r>
+      <w:proofErr w:type="spellEnd"/>
+      <w:r>
+        <w:rPr>
+          <w:rFonts w:ascii="Arial" w:hAnsi="Arial" w:cs="Arial"/>
+          <w:sz w:val="24"/>
+          <w:szCs w:val="24"/>
+        </w:rPr>
+        <w:t>.</w:t>
+      </w:r>
+    </w:p>
+    <w:p>
+      <w:pPr>
+        <w:rPr>
+          <w:rFonts w:ascii="Arial" w:hAnsi="Arial" w:cs="Arial"/>
+          <w:sz w:val="24"/>
+          <w:szCs w:val="24"/>
+        </w:rPr>
+      </w:pPr>
+      <w:r>
+        <w:rPr>
+          <w:rFonts w:ascii="Arial" w:hAnsi="Arial" w:cs="Arial"/>
+          <w:sz w:val="24"/>
+          <w:szCs w:val="24"/>
+        </w:rPr>
+        <w:t xml:space="preserve">Estas herramientas fueron utilizadas de manera responsable, con el objetivo de comprender mejor los conceptos trabajados en el curso y resolver dudas puntuales durante el desarrollo del proyecto. Por ejemplo, se emplearon para obtener explicaciones sobre el consumo de </w:t>
+      </w:r>
+      <w:proofErr w:type="spellStart"/>
+      <w:r>
+        <w:rPr>
+          <w:rFonts w:ascii="Arial" w:hAnsi="Arial" w:cs="Arial"/>
+          <w:sz w:val="24"/>
+          <w:szCs w:val="24"/>
+        </w:rPr>
+        <w:t>APIs</w:t>
+      </w:r>
+      <w:proofErr w:type="spellEnd"/>
+      <w:r>
+        <w:rPr>
+          <w:rFonts w:ascii="Arial" w:hAnsi="Arial" w:cs="Arial"/>
+          <w:sz w:val="24"/>
+          <w:szCs w:val="24"/>
+        </w:rPr>
+        <w:t xml:space="preserve">, el uso de </w:t>
+      </w:r>
+      <w:proofErr w:type="spellStart"/>
+      <w:r>
+        <w:rPr>
+          <w:rFonts w:ascii="Arial" w:hAnsi="Arial" w:cs="Arial"/>
+          <w:sz w:val="24"/>
+          <w:szCs w:val="24"/>
+        </w:rPr>
+        <w:t>fetch</w:t>
+      </w:r>
+      <w:proofErr w:type="spellEnd"/>
+      <w:r>
+        <w:rPr>
+          <w:rFonts w:ascii="Arial" w:hAnsi="Arial" w:cs="Arial"/>
+          <w:sz w:val="24"/>
+          <w:szCs w:val="24"/>
+        </w:rPr>
+        <w:t xml:space="preserve"> y </w:t>
+      </w:r>
+      <w:proofErr w:type="spellStart"/>
+      <w:r>
+        <w:rPr>
+          <w:rFonts w:ascii="Arial" w:hAnsi="Arial" w:cs="Arial"/>
+          <w:sz w:val="24"/>
+          <w:szCs w:val="24"/>
+        </w:rPr>
+        <w:t>async</w:t>
+      </w:r>
+      <w:proofErr w:type="spellEnd"/>
+      <w:r>
+        <w:rPr>
+          <w:rFonts w:ascii="Arial" w:hAnsi="Arial" w:cs="Arial"/>
+          <w:sz w:val="24"/>
+          <w:szCs w:val="24"/>
+        </w:rPr>
+        <w:t>/</w:t>
+      </w:r>
+      <w:proofErr w:type="spellStart"/>
+      <w:r>
+        <w:rPr>
+          <w:rFonts w:ascii="Arial" w:hAnsi="Arial" w:cs="Arial"/>
+          <w:sz w:val="24"/>
+          <w:szCs w:val="24"/>
+        </w:rPr>
+        <w:t>await</w:t>
+      </w:r>
+      <w:proofErr w:type="spellEnd"/>
+      <w:r>
+        <w:rPr>
+          <w:rFonts w:ascii="Arial" w:hAnsi="Arial" w:cs="Arial"/>
+          <w:sz w:val="24"/>
+          <w:szCs w:val="24"/>
+        </w:rPr>
+        <w:t>, así como para entender errores presentados en la consola.</w:t>
       </w:r>
     </w:p>
     <w:p>
@@ -720,8 +994,16 @@
           <w:sz w:val="24"/>
           <w:szCs w:val="24"/>
         </w:rPr>
+        <w:t xml:space="preserve">Es importante destacar que el uso de estas herramientas no sustituyó el aprendizaje, sino que lo complementó, permitiendo una mejor comprensión de cada parte del proyecto. Cada línea de código implementada fue analizada y </w:t>
+      </w:r>
+      <w:r>
+        <w:rPr>
+          <w:rFonts w:ascii="Arial" w:hAnsi="Arial" w:cs="Arial"/>
+          <w:sz w:val="24"/>
+          <w:szCs w:val="24"/>
+        </w:rPr>
         <w:lastRenderedPageBreak/>
-        <w:t>Es importante destacar que el uso de estas herramientas no sustituyó el aprendizaje, sino que lo complementó, permitiendo una mejor comprensión de cada parte del proyecto. Cada línea de código implementada fue analizada y comprendida, con el fin de poder explicarla correctamente en una posible sustentación.</w:t>
+        <w:t>comprendida, con el fin de poder explicarla correctamente en una posible sustentación.</w:t>
       </w:r>
     </w:p>
     <w:p>
@@ -801,6 +1083,7 @@
         </w:rPr>
         <w:t>Inicialmente, se creó un repositorio llamado "</w:t>
       </w:r>
+      <w:proofErr w:type="spellStart"/>
       <w:r>
         <w:rPr>
           <w:rFonts w:ascii="Arial" w:hAnsi="Arial" w:cs="Arial"/>
@@ -809,6 +1092,7 @@
         </w:rPr>
         <w:t>proyecto_final_api</w:t>
       </w:r>
+      <w:proofErr w:type="spellEnd"/>
       <w:r>
         <w:rPr>
           <w:rFonts w:ascii="Arial" w:hAnsi="Arial" w:cs="Arial"/>
@@ -832,24 +1116,78 @@
           <w:sz w:val="24"/>
           <w:szCs w:val="24"/>
         </w:rPr>
-        <w:t>Durante el desarrollo, se realizaron múltiples commits con mensajes descriptivos que reflejan los cambios realizados en cada etapa, permitiendo llevar un control claro del progreso del proyecto. Entre estos se incluyen la creación de la estructura HTML, la implementación del consumo de la API, la manipulación del DOM y la aplicación de estilos con CSS.</w:t>
-      </w:r>
-    </w:p>
-    <w:p>
-      <w:pPr>
-        <w:rPr>
-          <w:rFonts w:ascii="Arial" w:hAnsi="Arial" w:cs="Arial"/>
-          <w:sz w:val="24"/>
-          <w:szCs w:val="24"/>
-        </w:rPr>
-      </w:pPr>
-      <w:r>
-        <w:rPr>
-          <w:rFonts w:ascii="Arial" w:hAnsi="Arial" w:cs="Arial"/>
-          <w:sz w:val="24"/>
-          <w:szCs w:val="24"/>
-        </w:rPr>
-        <w:t>Finalmente, los cambios fueron enviados al repositorio remoto mediante el comando git push, garantizando que el proyecto estuviera actualizado y disponible en línea.</w:t>
+        <w:t xml:space="preserve">Durante el desarrollo, se realizaron múltiples </w:t>
+      </w:r>
+      <w:proofErr w:type="spellStart"/>
+      <w:r>
+        <w:rPr>
+          <w:rFonts w:ascii="Arial" w:hAnsi="Arial" w:cs="Arial"/>
+          <w:sz w:val="24"/>
+          <w:szCs w:val="24"/>
+        </w:rPr>
+        <w:t>commits</w:t>
+      </w:r>
+      <w:proofErr w:type="spellEnd"/>
+      <w:r>
+        <w:rPr>
+          <w:rFonts w:ascii="Arial" w:hAnsi="Arial" w:cs="Arial"/>
+          <w:sz w:val="24"/>
+          <w:szCs w:val="24"/>
+        </w:rPr>
+        <w:t xml:space="preserve"> con mensajes descriptivos que reflejan los cambios realizados en cada etapa, permitiendo llevar un control claro del progreso del proyecto. Entre estos se incluyen la creación de la estructura HTML, la implementación del consumo de la API, la manipulación del DOM y la aplicación de estilos con CSS.</w:t>
+      </w:r>
+    </w:p>
+    <w:p>
+      <w:pPr>
+        <w:rPr>
+          <w:rFonts w:ascii="Arial" w:hAnsi="Arial" w:cs="Arial"/>
+          <w:sz w:val="24"/>
+          <w:szCs w:val="24"/>
+        </w:rPr>
+      </w:pPr>
+      <w:r>
+        <w:rPr>
+          <w:rFonts w:ascii="Arial" w:hAnsi="Arial" w:cs="Arial"/>
+          <w:sz w:val="24"/>
+          <w:szCs w:val="24"/>
+        </w:rPr>
+        <w:t xml:space="preserve">Finalmente, los cambios fueron enviados al repositorio remoto mediante el comando </w:t>
+      </w:r>
+      <w:proofErr w:type="spellStart"/>
+      <w:r>
+        <w:rPr>
+          <w:rFonts w:ascii="Arial" w:hAnsi="Arial" w:cs="Arial"/>
+          <w:sz w:val="24"/>
+          <w:szCs w:val="24"/>
+        </w:rPr>
+        <w:t>git</w:t>
+      </w:r>
+      <w:proofErr w:type="spellEnd"/>
+      <w:r>
+        <w:rPr>
+          <w:rFonts w:ascii="Arial" w:hAnsi="Arial" w:cs="Arial"/>
+          <w:sz w:val="24"/>
+          <w:szCs w:val="24"/>
+        </w:rPr>
+        <w:t xml:space="preserve"> </w:t>
+      </w:r>
+      <w:proofErr w:type="spellStart"/>
+      <w:r>
+        <w:rPr>
+          <w:rFonts w:ascii="Arial" w:hAnsi="Arial" w:cs="Arial"/>
+          <w:sz w:val="24"/>
+          <w:szCs w:val="24"/>
+        </w:rPr>
+        <w:t>push</w:t>
+      </w:r>
+      <w:proofErr w:type="spellEnd"/>
+      <w:r>
+        <w:rPr>
+          <w:rFonts w:ascii="Arial" w:hAnsi="Arial" w:cs="Arial"/>
+          <w:sz w:val="24"/>
+          <w:szCs w:val="24"/>
+        </w:rPr>
+        <w:t>, garantizando que el proyecto estuviera actualizado y disponible en línea.</w:t>
       </w:r>
     </w:p>
     <w:p>

</xml_diff>